<commit_message>
docs: refresh README + How-Penguix-Was-Built for 0.5.x; comment customer-history query
</commit_message>
<xml_diff>
--- a/docs/HOW_PENGUIX_WAS_BUILT.docx
+++ b/docs/HOW_PENGUIX_WAS_BUILT.docx
@@ -2,32 +2,6 @@
 <file path=word/document.xml><?xml version="1.0" encoding="utf-8"?>
 <w:document xmlns:w="http://schemas.openxmlformats.org/wordprocessingml/2006/main" xmlns:m="http://schemas.openxmlformats.org/officeDocument/2006/math" xmlns:r="http://schemas.openxmlformats.org/officeDocument/2006/relationships" xmlns:o="urn:schemas-microsoft-com:office:office" xmlns:v="urn:schemas-microsoft-com:vml" xmlns:w10="urn:schemas-microsoft-com:office:word" xmlns:a="http://schemas.openxmlformats.org/drawingml/2006/main" xmlns:pic="http://schemas.openxmlformats.org/drawingml/2006/picture" xmlns:wp="http://schemas.openxmlformats.org/drawingml/2006/wordprocessingDrawing">
   <w:body>
-    <w:sdt>
-      <w:sdtPr>
-        <w:docPartObj>
-          <w:docPartGallery w:val="Table of Contents"/>
-          <w:docPartUnique/>
-        </w:docPartObj>
-      </w:sdtPr>
-      <w:sdtContent>
-        <w:p>
-          <w:pPr>
-            <w:pStyle w:val="TOCHeading"/>
-          </w:pPr>
-          <w:r>
-            <w:t xml:space="preserve">Table of Contents</w:t>
-          </w:r>
-        </w:p>
-        <w:p>
-          <w:r>
-            <w:fldChar w:fldCharType="begin" w:dirty="true"/>
-            <w:instrText xml:space="preserve">TOC \o "1-2" \h \z \u</w:instrText>
-            <w:fldChar w:fldCharType="separate"/>
-            <w:fldChar w:fldCharType="end"/>
-          </w:r>
-        </w:p>
-      </w:sdtContent>
-    </w:sdt>
     <w:p>
       <w:pPr>
         <w:pStyle w:val="Heading1"/>
@@ -3945,6 +3919,851 @@
       </w:r>
     </w:p>
     <w:p>
+      <w:pPr>
+        <w:pStyle w:val="Heading2"/>
+      </w:pPr>
+      <w:bookmarkStart w:id="40" w:name="beyond-0.4.0-the-0.5.x-line"/>
+      <w:r>
+        <w:t xml:space="preserve">14. Beyond 0.4.0 — the 0.5.x line</w:t>
+      </w:r>
+      <w:bookmarkEnd w:id="40"/>
+    </w:p>
+    <w:p>
+      <w:pPr>
+        <w:pStyle w:val="FirstParagraph"/>
+      </w:pPr>
+      <w:r>
+        <w:t xml:space="preserve">After the first packaged release the app kept growing. Each addition followed the</w:t>
+      </w:r>
+      <w:r>
+        <w:t xml:space="preserve"> </w:t>
+      </w:r>
+      <w:r>
+        <w:t xml:space="preserve">same discipline (services own the logic and the SQL, controllers guard access,</w:t>
+      </w:r>
+      <w:r>
+        <w:t xml:space="preserve"> </w:t>
+      </w:r>
+      <w:r>
+        <w:t xml:space="preserve">views stay thin, and a headless test proves it), and each shipped through the new</w:t>
+      </w:r>
+      <w:r>
+        <w:t xml:space="preserve"> </w:t>
+      </w:r>
+      <w:r>
+        <w:t xml:space="preserve">auto-update pipeline. Schema is now at</w:t>
+      </w:r>
+      <w:r>
+        <w:t xml:space="preserve"> </w:t>
+      </w:r>
+      <w:r>
+        <w:rPr>
+          <w:b/>
+        </w:rPr>
+        <w:t xml:space="preserve">version 10</w:t>
+      </w:r>
+      <w:r>
+        <w:t xml:space="preserve">.</w:t>
+      </w:r>
+    </w:p>
+    <w:p>
+      <w:pPr>
+        <w:pStyle w:val="Heading3"/>
+      </w:pPr>
+      <w:bookmarkStart w:id="41" w:name="partial-line-level-returns"/>
+      <w:r>
+        <w:t xml:space="preserve">14.1 Partial / line-level returns</w:t>
+      </w:r>
+      <w:bookmarkEnd w:id="41"/>
+    </w:p>
+    <w:p>
+      <w:pPr>
+        <w:pStyle w:val="FirstParagraph"/>
+      </w:pPr>
+      <w:r>
+        <w:t xml:space="preserve">The early</w:t>
+      </w:r>
+      <w:r>
+        <w:t xml:space="preserve"> </w:t>
+      </w:r>
+      <w:r>
+        <w:t xml:space="preserve">“</w:t>
+      </w:r>
+      <w:r>
+        <w:t xml:space="preserve">return</w:t>
+      </w:r>
+      <w:r>
+        <w:t xml:space="preserve">”</w:t>
+      </w:r>
+      <w:r>
+        <w:t xml:space="preserve"> </w:t>
+      </w:r>
+      <w:r>
+        <w:t xml:space="preserve">simply voided a whole invoice. That was replaced by a proper</w:t>
+      </w:r>
+      <w:r>
+        <w:t xml:space="preserve"> </w:t>
+      </w:r>
+      <w:r>
+        <w:rPr>
+          <w:b/>
+        </w:rPr>
+        <w:t xml:space="preserve">returns ledger</w:t>
+      </w:r>
+      <w:r>
+        <w:t xml:space="preserve">. Two tables,</w:t>
+      </w:r>
+      <w:r>
+        <w:t xml:space="preserve"> </w:t>
+      </w:r>
+      <w:r>
+        <w:rPr>
+          <w:rStyle w:val="VerbatimChar"/>
+        </w:rPr>
+        <w:t xml:space="preserve">sale_returns</w:t>
+      </w:r>
+      <w:r>
+        <w:t xml:space="preserve"> </w:t>
+      </w:r>
+      <w:r>
+        <w:t xml:space="preserve">and</w:t>
+      </w:r>
+      <w:r>
+        <w:t xml:space="preserve"> </w:t>
+      </w:r>
+      <w:r>
+        <w:rPr>
+          <w:rStyle w:val="VerbatimChar"/>
+        </w:rPr>
+        <w:t xml:space="preserve">sale_return_items</w:t>
+      </w:r>
+      <w:r>
+        <w:t xml:space="preserve">, record who</w:t>
+      </w:r>
+      <w:r>
+        <w:t xml:space="preserve"> </w:t>
+      </w:r>
+      <w:r>
+        <w:t xml:space="preserve">returned what, how much was refunded, and which invoice it came from;</w:t>
+      </w:r>
+      <w:r>
+        <w:t xml:space="preserve"> </w:t>
+      </w:r>
+      <w:r>
+        <w:rPr>
+          <w:rStyle w:val="VerbatimChar"/>
+        </w:rPr>
+        <w:t xml:space="preserve">sale_items.returned_qty</w:t>
+      </w:r>
+      <w:r>
+        <w:t xml:space="preserve"> </w:t>
+      </w:r>
+      <w:r>
+        <w:t xml:space="preserve">caps how much of each line can still be returned. The</w:t>
+      </w:r>
+      <w:r>
+        <w:t xml:space="preserve"> </w:t>
+      </w:r>
+      <w:r>
+        <w:t xml:space="preserve">original sale is left</w:t>
+      </w:r>
+      <w:r>
+        <w:t xml:space="preserve"> </w:t>
+      </w:r>
+      <w:r>
+        <w:rPr>
+          <w:b/>
+        </w:rPr>
+        <w:t xml:space="preserve">completed</w:t>
+      </w:r>
+      <w:r>
+        <w:t xml:space="preserve"> </w:t>
+      </w:r>
+      <w:r>
+        <w:t xml:space="preserve">— nothing is rewritten. Reports are computed</w:t>
+      </w:r>
+      <w:r>
+        <w:t xml:space="preserve"> </w:t>
+      </w:r>
+      <w:r>
+        <w:rPr>
+          <w:b/>
+        </w:rPr>
+        <w:t xml:space="preserve">net of returns</w:t>
+      </w:r>
+      <w:r>
+        <w:t xml:space="preserve">: the day-close shows a Refunds line and a Net that subtracts</w:t>
+      </w:r>
+      <w:r>
+        <w:t xml:space="preserve"> </w:t>
+      </w:r>
+      <w:r>
+        <w:t xml:space="preserve">them, and the profit report backs out the returned items’ margin. Returning a line</w:t>
+      </w:r>
+      <w:r>
+        <w:t xml:space="preserve"> </w:t>
+      </w:r>
+      <w:r>
+        <w:t xml:space="preserve">adds its quantity back to stock.</w:t>
+      </w:r>
+    </w:p>
+    <w:p>
+      <w:pPr>
+        <w:pStyle w:val="Heading3"/>
+      </w:pPr>
+      <w:bookmarkStart w:id="42" w:name="supplier-payables"/>
+      <w:r>
+        <w:t xml:space="preserve">14.2 Supplier payables</w:t>
+      </w:r>
+      <w:bookmarkEnd w:id="42"/>
+    </w:p>
+    <w:p>
+      <w:pPr>
+        <w:pStyle w:val="FirstParagraph"/>
+      </w:pPr>
+      <w:r>
+        <w:t xml:space="preserve">Purchases gained an optional</w:t>
+      </w:r>
+      <w:r>
+        <w:t xml:space="preserve"> </w:t>
+      </w:r>
+      <w:r>
+        <w:t xml:space="preserve">“</w:t>
+      </w:r>
+      <w:r>
+        <w:t xml:space="preserve">amount paid now</w:t>
+      </w:r>
+      <w:r>
+        <w:t xml:space="preserve">”</w:t>
+      </w:r>
+      <w:r>
+        <w:t xml:space="preserve"> </w:t>
+      </w:r>
+      <w:r>
+        <w:t xml:space="preserve">field, turning them into credit</w:t>
+      </w:r>
+      <w:r>
+        <w:t xml:space="preserve"> </w:t>
+      </w:r>
+      <w:r>
+        <w:t xml:space="preserve">purchases when it is less than the total. A</w:t>
+      </w:r>
+      <w:r>
+        <w:t xml:space="preserve"> </w:t>
+      </w:r>
+      <w:r>
+        <w:rPr>
+          <w:rStyle w:val="VerbatimChar"/>
+        </w:rPr>
+        <w:t xml:space="preserve">supplier_payments</w:t>
+      </w:r>
+      <w:r>
+        <w:t xml:space="preserve"> </w:t>
+      </w:r>
+      <w:r>
+        <w:t xml:space="preserve">ledger records</w:t>
+      </w:r>
+      <w:r>
+        <w:t xml:space="preserve"> </w:t>
+      </w:r>
+      <w:r>
+        <w:t xml:space="preserve">later payments, and a Payables screen shows, per supplier, what was purchased, what</w:t>
+      </w:r>
+      <w:r>
+        <w:t xml:space="preserve"> </w:t>
+      </w:r>
+      <w:r>
+        <w:t xml:space="preserve">was paid, and the balance owed — with a per-supplier ledger dialog. Deliberately,</w:t>
+      </w:r>
+      <w:r>
+        <w:t xml:space="preserve"> </w:t>
+      </w:r>
+      <w:r>
+        <w:t xml:space="preserve">payables are</w:t>
+      </w:r>
+      <w:r>
+        <w:t xml:space="preserve"> </w:t>
+      </w:r>
+      <w:r>
+        <w:rPr>
+          <w:b/>
+        </w:rPr>
+        <w:t xml:space="preserve">kept out of the P&amp;L</w:t>
+      </w:r>
+      <w:r>
+        <w:t xml:space="preserve">: buying stock is not an expense (it becomes</w:t>
+      </w:r>
+      <w:r>
+        <w:t xml:space="preserve"> </w:t>
+      </w:r>
+      <w:r>
+        <w:t xml:space="preserve">cost of goods sold when the item sells), and paying a supplier is a cash movement,</w:t>
+      </w:r>
+      <w:r>
+        <w:t xml:space="preserve"> </w:t>
+      </w:r>
+      <w:r>
+        <w:t xml:space="preserve">not a cost.</w:t>
+      </w:r>
+    </w:p>
+    <w:p>
+      <w:pPr>
+        <w:pStyle w:val="Heading3"/>
+      </w:pPr>
+      <w:bookmarkStart w:id="43" w:name="customer-directory-purchase-history"/>
+      <w:r>
+        <w:t xml:space="preserve">14.3 Customer directory + purchase history</w:t>
+      </w:r>
+      <w:bookmarkEnd w:id="43"/>
+    </w:p>
+    <w:p>
+      <w:pPr>
+        <w:pStyle w:val="FirstParagraph"/>
+      </w:pPr>
+      <w:r>
+        <w:t xml:space="preserve">Sales can optionally be attached to a customer (name + phone; walk-ins stay</w:t>
+      </w:r>
+      <w:r>
+        <w:t xml:space="preserve"> </w:t>
+      </w:r>
+      <w:r>
+        <w:t xml:space="preserve">anonymous). A returning customer is matched on (name, phone) with the phone</w:t>
+      </w:r>
+      <w:r>
+        <w:t xml:space="preserve"> </w:t>
+      </w:r>
+      <w:r>
+        <w:t xml:space="preserve">normalised to digits. The Customers screen shows each person’s history — which</w:t>
+      </w:r>
+      <w:r>
+        <w:t xml:space="preserve"> </w:t>
+      </w:r>
+      <w:r>
+        <w:t xml:space="preserve">products they bought, how many visits, last price and date — so a cashier can</w:t>
+      </w:r>
+      <w:r>
+        <w:t xml:space="preserve"> </w:t>
+      </w:r>
+      <w:r>
+        <w:t xml:space="preserve">answer</w:t>
+      </w:r>
+      <w:r>
+        <w:t xml:space="preserve"> </w:t>
+      </w:r>
+      <w:r>
+        <w:t xml:space="preserve">“</w:t>
+      </w:r>
+      <w:r>
+        <w:t xml:space="preserve">which oil did I use last time?</w:t>
+      </w:r>
+      <w:r>
+        <w:t xml:space="preserve">”</w:t>
+      </w:r>
+      <w:r>
+        <w:t xml:space="preserve">. At the POS, picking a customer opens a</w:t>
+      </w:r>
+      <w:r>
+        <w:t xml:space="preserve"> </w:t>
+      </w:r>
+      <w:r>
+        <w:rPr>
+          <w:b/>
+        </w:rPr>
+        <w:t xml:space="preserve">reorder dialog</w:t>
+      </w:r>
+      <w:r>
+        <w:t xml:space="preserve"> </w:t>
+      </w:r>
+      <w:r>
+        <w:t xml:space="preserve">listing their previously-bought products (current price/stock);</w:t>
+      </w:r>
+      <w:r>
+        <w:t xml:space="preserve"> </w:t>
+      </w:r>
+      <w:r>
+        <w:t xml:space="preserve">ticked items drop straight into the cart through the normal add-to-cart path.</w:t>
+      </w:r>
+    </w:p>
+    <w:p>
+      <w:pPr>
+        <w:pStyle w:val="Heading3"/>
+      </w:pPr>
+      <w:bookmarkStart w:id="44" w:name="localization-and-touchscreens"/>
+      <w:r>
+        <w:t xml:space="preserve">14.4 Localization and touchscreens</w:t>
+      </w:r>
+      <w:bookmarkEnd w:id="44"/>
+    </w:p>
+    <w:p>
+      <w:pPr>
+        <w:pStyle w:val="FirstParagraph"/>
+      </w:pPr>
+      <w:r>
+        <w:t xml:space="preserve">A lightweight in-house translation layer (</w:t>
+      </w:r>
+      <w:r>
+        <w:rPr>
+          <w:rStyle w:val="VerbatimChar"/>
+        </w:rPr>
+        <w:t xml:space="preserve">core/i18n.py</w:t>
+      </w:r>
+      <w:r>
+        <w:t xml:space="preserve">, a plain dict plus a</w:t>
+      </w:r>
+      <w:r>
+        <w:t xml:space="preserve"> </w:t>
+      </w:r>
+      <w:r>
+        <w:rPr>
+          <w:rStyle w:val="VerbatimChar"/>
+        </w:rPr>
+        <w:t xml:space="preserve">tr()</w:t>
+      </w:r>
+      <w:r>
+        <w:t xml:space="preserve"> </w:t>
+      </w:r>
+      <w:r>
+        <w:t xml:space="preserve">helper) adds an</w:t>
+      </w:r>
+      <w:r>
+        <w:t xml:space="preserve"> </w:t>
+      </w:r>
+      <w:r>
+        <w:rPr>
+          <w:b/>
+        </w:rPr>
+        <w:t xml:space="preserve">English/Urdu</w:t>
+      </w:r>
+      <w:r>
+        <w:t xml:space="preserve"> </w:t>
+      </w:r>
+      <w:r>
+        <w:t xml:space="preserve">toggle covering the counter screens and the</w:t>
+      </w:r>
+      <w:r>
+        <w:t xml:space="preserve"> </w:t>
+      </w:r>
+      <w:r>
+        <w:t xml:space="preserve">receipt; Urdu is shown left-to-right to avoid re-flowing every layout. A</w:t>
+      </w:r>
+      <w:r>
+        <w:t xml:space="preserve"> </w:t>
+      </w:r>
+      <w:r>
+        <w:rPr>
+          <w:b/>
+        </w:rPr>
+        <w:t xml:space="preserve">touchscreen mode</w:t>
+      </w:r>
+      <w:r>
+        <w:t xml:space="preserve"> </w:t>
+      </w:r>
+      <w:r>
+        <w:t xml:space="preserve">adds an on-screen numeric keypad to the Sale screen whose keys</w:t>
+      </w:r>
+      <w:r>
+        <w:t xml:space="preserve"> </w:t>
+      </w:r>
+      <w:r>
+        <w:t xml:space="preserve">never steal focus, so one shared pad drives every numeric field. Both are admin</w:t>
+      </w:r>
+      <w:r>
+        <w:t xml:space="preserve"> </w:t>
+      </w:r>
+      <w:r>
+        <w:t xml:space="preserve">settings.</w:t>
+      </w:r>
+    </w:p>
+    <w:p>
+      <w:pPr>
+        <w:pStyle w:val="Heading3"/>
+      </w:pPr>
+      <w:bookmarkStart w:id="45" w:name="auto-update-the-biggest-addition"/>
+      <w:r>
+        <w:t xml:space="preserve">14.5 Auto-update (the biggest addition)</w:t>
+      </w:r>
+      <w:bookmarkEnd w:id="45"/>
+    </w:p>
+    <w:p>
+      <w:pPr>
+        <w:pStyle w:val="FirstParagraph"/>
+      </w:pPr>
+      <w:r>
+        <w:t xml:space="preserve">Penguix updates itself from</w:t>
+      </w:r>
+      <w:r>
+        <w:t xml:space="preserve"> </w:t>
+      </w:r>
+      <w:r>
+        <w:rPr>
+          <w:b/>
+        </w:rPr>
+        <w:t xml:space="preserve">GitHub Releases</w:t>
+      </w:r>
+      <w:r>
+        <w:t xml:space="preserve"> </w:t>
+      </w:r>
+      <w:r>
+        <w:t xml:space="preserve">using an</w:t>
+      </w:r>
+      <w:r>
+        <w:t xml:space="preserve"> </w:t>
+      </w:r>
+      <w:r>
+        <w:rPr>
+          <w:b/>
+        </w:rPr>
+        <w:t xml:space="preserve">Ed25519-signed manifest</w:t>
+      </w:r>
+      <w:r>
+        <w:t xml:space="preserve">.</w:t>
+      </w:r>
+      <w:r>
+        <w:t xml:space="preserve"> </w:t>
+      </w:r>
+      <w:r>
+        <w:t xml:space="preserve">A tiny</w:t>
+      </w:r>
+      <w:r>
+        <w:t xml:space="preserve"> </w:t>
+      </w:r>
+      <w:r>
+        <w:rPr>
+          <w:rStyle w:val="VerbatimChar"/>
+        </w:rPr>
+        <w:t xml:space="preserve">latest.json</w:t>
+      </w:r>
+      <w:r>
+        <w:t xml:space="preserve"> </w:t>
+      </w:r>
+      <w:r>
+        <w:t xml:space="preserve">—</w:t>
+      </w:r>
+      <w:r>
+        <w:t xml:space="preserve"> </w:t>
+      </w:r>
+      <w:r>
+        <w:rPr>
+          <w:rStyle w:val="VerbatimChar"/>
+        </w:rPr>
+        <w:t xml:space="preserve">{data:{version,url,sha256,notes}, sig}</w:t>
+      </w:r>
+      <w:r>
+        <w:t xml:space="preserve"> </w:t>
+      </w:r>
+      <w:r>
+        <w:t xml:space="preserve">— is published with</w:t>
+      </w:r>
+      <w:r>
+        <w:t xml:space="preserve"> </w:t>
+      </w:r>
+      <w:r>
+        <w:t xml:space="preserve">each release. The app fetches it, verifies the signature against a public key baked</w:t>
+      </w:r>
+      <w:r>
+        <w:t xml:space="preserve"> </w:t>
+      </w:r>
+      <w:r>
+        <w:t xml:space="preserve">into the binary, compares versions, downloads the installer, checks its SHA-256, and</w:t>
+      </w:r>
+      <w:r>
+        <w:t xml:space="preserve"> </w:t>
+      </w:r>
+      <w:r>
+        <w:t xml:space="preserve">(with the admin’s consent) runs it and exits so the installer can replace the files.</w:t>
+      </w:r>
+      <w:r>
+        <w:t xml:space="preserve"> </w:t>
+      </w:r>
+      <w:r>
+        <w:t xml:space="preserve">Because the manifest is signed, a tampered installer</w:t>
+      </w:r>
+      <w:r>
+        <w:t xml:space="preserve"> </w:t>
+      </w:r>
+      <w:r>
+        <w:rPr>
+          <w:b/>
+        </w:rPr>
+        <w:t xml:space="preserve">or</w:t>
+      </w:r>
+      <w:r>
+        <w:t xml:space="preserve"> </w:t>
+      </w:r>
+      <w:r>
+        <w:t xml:space="preserve">a tampered manifest is</w:t>
+      </w:r>
+      <w:r>
+        <w:t xml:space="preserve"> </w:t>
+      </w:r>
+      <w:r>
+        <w:t xml:space="preserve">rejected even if the hosting is compromised — the attacker lacks the private key.</w:t>
+      </w:r>
+      <w:r>
+        <w:t xml:space="preserve"> </w:t>
+      </w:r>
+      <w:r>
+        <w:t xml:space="preserve">The crypto is a self-contained pure-Python RFC 8032 implementation (</w:t>
+      </w:r>
+      <w:r>
+        <w:rPr>
+          <w:rStyle w:val="VerbatimChar"/>
+        </w:rPr>
+        <w:t xml:space="preserve">core/ed25519.py</w:t>
+      </w:r>
+      <w:r>
+        <w:t xml:space="preserve">),</w:t>
+      </w:r>
+      <w:r>
+        <w:t xml:space="preserve"> </w:t>
+      </w:r>
+      <w:r>
+        <w:t xml:space="preserve">validated byte-for-byte against the reference</w:t>
+      </w:r>
+      <w:r>
+        <w:t xml:space="preserve"> </w:t>
+      </w:r>
+      <w:r>
+        <w:rPr>
+          <w:rStyle w:val="VerbatimChar"/>
+        </w:rPr>
+        <w:t xml:space="preserve">cryptography</w:t>
+      </w:r>
+      <w:r>
+        <w:t xml:space="preserve"> </w:t>
+      </w:r>
+      <w:r>
+        <w:t xml:space="preserve">library, so there is no</w:t>
+      </w:r>
+      <w:r>
+        <w:t xml:space="preserve"> </w:t>
+      </w:r>
+      <w:r>
+        <w:t xml:space="preserve">new runtime dependency. Update controls are</w:t>
+      </w:r>
+      <w:r>
+        <w:t xml:space="preserve"> </w:t>
+      </w:r>
+      <w:r>
+        <w:rPr>
+          <w:b/>
+        </w:rPr>
+        <w:t xml:space="preserve">admin-only</w:t>
+      </w:r>
+      <w:r>
+        <w:t xml:space="preserve"> </w:t>
+      </w:r>
+      <w:r>
+        <w:t xml:space="preserve">(Settings → Updates); the</w:t>
+      </w:r>
+      <w:r>
+        <w:t xml:space="preserve"> </w:t>
+      </w:r>
+      <w:r>
+        <w:t xml:space="preserve">database lives in AppData, so updates never touch shop data and migrations run on the</w:t>
+      </w:r>
+      <w:r>
+        <w:t xml:space="preserve"> </w:t>
+      </w:r>
+      <w:r>
+        <w:t xml:space="preserve">next launch. Releases are cut with</w:t>
+      </w:r>
+      <w:r>
+        <w:t xml:space="preserve"> </w:t>
+      </w:r>
+      <w:r>
+        <w:rPr>
+          <w:rStyle w:val="VerbatimChar"/>
+        </w:rPr>
+        <w:t xml:space="preserve">tools/release.py</w:t>
+      </w:r>
+      <w:r>
+        <w:t xml:space="preserve">, which stamps, hashes and signs</w:t>
+      </w:r>
+      <w:r>
+        <w:t xml:space="preserve"> </w:t>
+      </w:r>
+      <w:r>
+        <w:t xml:space="preserve">the manifest;</w:t>
+      </w:r>
+      <w:r>
+        <w:t xml:space="preserve"> </w:t>
+      </w:r>
+      <w:r>
+        <w:rPr>
+          <w:rStyle w:val="VerbatimChar"/>
+        </w:rPr>
+        <w:t xml:space="preserve">tools/keygen.py</w:t>
+      </w:r>
+      <w:r>
+        <w:t xml:space="preserve"> </w:t>
+      </w:r>
+      <w:r>
+        <w:t xml:space="preserve">created the keypair (private seed git-ignored).</w:t>
+      </w:r>
+    </w:p>
+    <w:p>
+      <w:pPr>
+        <w:pStyle w:val="BodyText"/>
+      </w:pPr>
+      <w:r>
+        <w:t xml:space="preserve">Two subtle bugs surfaced while testing it and were fixed: the daily</w:t>
+      </w:r>
+      <w:r>
+        <w:t xml:space="preserve"> </w:t>
+      </w:r>
+      <w:r>
+        <w:t xml:space="preserve">“</w:t>
+      </w:r>
+      <w:r>
+        <w:t xml:space="preserve">already checked</w:t>
+      </w:r>
+      <w:r>
+        <w:t xml:space="preserve">”</w:t>
+      </w:r>
+      <w:r>
+        <w:t xml:space="preserve"> </w:t>
+      </w:r>
+      <w:r>
+        <w:t xml:space="preserve">marker moved from the database to a file (the check runs on a background thread and</w:t>
+      </w:r>
+      <w:r>
+        <w:t xml:space="preserve"> </w:t>
+      </w:r>
+      <w:r>
+        <w:t xml:space="preserve">SQLite connections are thread-bound), and the installer now clears PyInstaller’s</w:t>
+      </w:r>
+      <w:r>
+        <w:t xml:space="preserve"> </w:t>
+      </w:r>
+      <w:r>
+        <w:rPr>
+          <w:rStyle w:val="VerbatimChar"/>
+        </w:rPr>
+        <w:t xml:space="preserve">_PYI*</w:t>
+      </w:r>
+      <w:r>
+        <w:t xml:space="preserve"> </w:t>
+      </w:r>
+      <w:r>
+        <w:t xml:space="preserve">environment variables before relaunching (otherwise the new one-file exe tried</w:t>
+      </w:r>
+      <w:r>
+        <w:t xml:space="preserve"> </w:t>
+      </w:r>
+      <w:r>
+        <w:t xml:space="preserve">to load its Python DLL from the old, deleted temp folder).</w:t>
+      </w:r>
+    </w:p>
+    <w:p>
+      <w:pPr>
+        <w:pStyle w:val="Heading3"/>
+      </w:pPr>
+      <w:bookmarkStart w:id="46" w:name="settings-backups-and-a-flush-fix"/>
+      <w:r>
+        <w:t xml:space="preserve">14.6 Settings, backups, and a flush fix</w:t>
+      </w:r>
+      <w:bookmarkEnd w:id="46"/>
+    </w:p>
+    <w:p>
+      <w:pPr>
+        <w:pStyle w:val="FirstParagraph"/>
+      </w:pPr>
+      <w:r>
+        <w:t xml:space="preserve">Settings became a</w:t>
+      </w:r>
+      <w:r>
+        <w:t xml:space="preserve"> </w:t>
+      </w:r>
+      <w:r>
+        <w:rPr>
+          <w:b/>
+        </w:rPr>
+        <w:t xml:space="preserve">tabbed</w:t>
+      </w:r>
+      <w:r>
+        <w:t xml:space="preserve"> </w:t>
+      </w:r>
+      <w:r>
+        <w:t xml:space="preserve">screen (Shop, Currency &amp; Invoice, Display, Tax, Payment</w:t>
+      </w:r>
+      <w:r>
+        <w:t xml:space="preserve"> </w:t>
+      </w:r>
+      <w:r>
+        <w:t xml:space="preserve">Accounts, Updates, Danger Zone) instead of one long scroll. Manual backup gained a</w:t>
+      </w:r>
+      <w:r>
+        <w:t xml:space="preserve"> </w:t>
+      </w:r>
+      <w:r>
+        <w:rPr>
+          <w:b/>
+        </w:rPr>
+        <w:t xml:space="preserve">“</w:t>
+      </w:r>
+      <w:r>
+        <w:rPr>
+          <w:b/>
+        </w:rPr>
+        <w:t xml:space="preserve">choose where to save</w:t>
+      </w:r>
+      <w:r>
+        <w:rPr>
+          <w:b/>
+        </w:rPr>
+        <w:t xml:space="preserve">”</w:t>
+      </w:r>
+      <w:r>
+        <w:t xml:space="preserve"> </w:t>
+      </w:r>
+      <w:r>
+        <w:t xml:space="preserve">dialog; the backup itself is a whole-database snapshot via</w:t>
+      </w:r>
+      <w:r>
+        <w:t xml:space="preserve"> </w:t>
+      </w:r>
+      <w:r>
+        <w:t xml:space="preserve">SQLite’s online-backup API, so it always includes every table (verified table-by-table</w:t>
+      </w:r>
+      <w:r>
+        <w:t xml:space="preserve"> </w:t>
+      </w:r>
+      <w:r>
+        <w:t xml:space="preserve">against a live database). Finally, the Danger-Zone</w:t>
+      </w:r>
+      <w:r>
+        <w:t xml:space="preserve"> </w:t>
+      </w:r>
+      <w:r>
+        <w:t xml:space="preserve">“</w:t>
+      </w:r>
+      <w:r>
+        <w:t xml:space="preserve">flush all data</w:t>
+      </w:r>
+      <w:r>
+        <w:t xml:space="preserve">”</w:t>
+      </w:r>
+      <w:r>
+        <w:t xml:space="preserve"> </w:t>
+      </w:r>
+      <w:r>
+        <w:t xml:space="preserve">was updated to clear</w:t>
+      </w:r>
+      <w:r>
+        <w:t xml:space="preserve"> </w:t>
+      </w:r>
+      <w:r>
+        <w:t xml:space="preserve">the new returns/payables/customers tables in the right order (with deferred foreign-key</w:t>
+      </w:r>
+      <w:r>
+        <w:t xml:space="preserve"> </w:t>
+      </w:r>
+      <w:r>
+        <w:t xml:space="preserve">checks) after it started failing with a foreign-key error once those tables held data.</w:t>
+      </w:r>
+    </w:p>
+    <w:p>
       <w:r>
         <w:pict>
           <v:rect style="width:0;height:1.5pt" o:hralign="center" o:hrstd="t" o:hr="t"/>
@@ -3959,7 +4778,7 @@
         <w:rPr>
           <w:i/>
         </w:rPr>
-        <w:t xml:space="preserve">Document generated for the Penguix (LubriPOS) project — version 0.4.0.</w:t>
+        <w:t xml:space="preserve">Document generated for the Penguix (LubriPOS) project — version 0.5.9.</w:t>
       </w:r>
     </w:p>
     <w:sectPr/>

</xml_diff>